<commit_message>
v.1.5.5: Language Settings - Fase 3
- data for spanish, english and valencian
- Language Settings finished
</commit_message>
<xml_diff>
--- a/data/memories/memory_01/locales/es/documents/director/Old Organisation Notes.docx
+++ b/data/memories/memory_01/locales/es/documents/director/Old Organisation Notes.docx
@@ -8,7 +8,7 @@
         <w:jc w:val="center"/>
       </w:pPr>
       <w:r>
-        <w:t>Old Organisation Notes</w:t>
+        <w:t>Notas de organización antiguas</w:t>
       </w:r>
     </w:p>
     <w:p>
@@ -19,7 +19,7 @@
         <w:t xml:space="preserve">Classification: </w:t>
       </w:r>
       <w:r>
-        <w:t>Internal</w:t>
+        <w:t>Interno</w:t>
       </w:r>
       <w:r>
         <w:rPr>
@@ -39,7 +39,7 @@
         <w:t xml:space="preserve">Author: </w:t>
       </w:r>
       <w:r>
-        <w:t>Management Office</w:t>
+        <w:t>Oficina de Gestión</w:t>
       </w:r>
     </w:p>
     <w:p/>
@@ -48,7 +48,7 @@
         <w:pStyle w:val="Heading1"/>
       </w:pPr>
       <w:r>
-        <w:t>Restructuring Preparation Notes</w:t>
+        <w:t>Notas de preparación de reestructuración</w:t>
       </w:r>
     </w:p>
     <w:p>
@@ -56,7 +56,7 @@
         <w:rPr>
           <w:sz w:val="22"/>
         </w:rPr>
-        <w:t>These notes were prepared before the organisational update. They contain preliminary observations and should be compared with the final approved structure.</w:t>
+        <w:t>Estas notas fueron preparadas antes de la actualización organizacional. Contienen observaciones preliminares y deben compararse con la estructura final aprobada.</w:t>
       </w:r>
     </w:p>
     <w:p>
@@ -64,7 +64,7 @@
         <w:pStyle w:val="Heading1"/>
       </w:pPr>
       <w:r>
-        <w:t>Main Topics</w:t>
+        <w:t>Temas principales</w:t>
       </w:r>
     </w:p>
     <w:p>
@@ -72,7 +72,7 @@
         <w:pStyle w:val="ListBullet"/>
       </w:pPr>
       <w:r>
-        <w:t>Reduce duplicated responsibilities.</w:t>
+        <w:t>Reducir responsabilidades duplicadas.</w:t>
       </w:r>
     </w:p>
     <w:p>
@@ -80,7 +80,7 @@
         <w:pStyle w:val="ListBullet"/>
       </w:pPr>
       <w:r>
-        <w:t>Improve document ownership.</w:t>
+        <w:t>Mejorar la propiedad de los documentos.</w:t>
       </w:r>
     </w:p>
     <w:p>
@@ -88,7 +88,7 @@
         <w:pStyle w:val="ListBullet"/>
       </w:pPr>
       <w:r>
-        <w:t>Clarify reporting lines.</w:t>
+        <w:t>Aclarar las líneas jerárquicas.</w:t>
       </w:r>
     </w:p>
     <w:p>
@@ -96,7 +96,7 @@
         <w:pStyle w:val="ListBullet"/>
       </w:pPr>
       <w:r>
-        <w:t>Review historical assignments.</w:t>
+        <w:t>Revisar asignaciones históricas.</w:t>
       </w:r>
     </w:p>
     <w:p>
@@ -104,7 +104,7 @@
         <w:pStyle w:val="Heading1"/>
       </w:pPr>
       <w:r>
-        <w:t>Operations Review</w:t>
+        <w:t>Revisión de operaciones</w:t>
       </w:r>
     </w:p>
     <w:p>
@@ -112,7 +112,7 @@
         <w:rPr>
           <w:sz w:val="22"/>
         </w:rPr>
-        <w:t>The Operations coordination role requires special consideration because several ongoing projects depend on historical knowledge and previous documentation.</w:t>
+        <w:t>La función de coordinación de operaciones requiere una consideración especial porque varios proyectos en curso dependen del conocimiento histórico y la documentación previa.</w:t>
       </w:r>
     </w:p>
     <w:p>
@@ -120,7 +120,7 @@
         <w:rPr>
           <w:sz w:val="22"/>
         </w:rPr>
-        <w:t>The transition plan should ensure that project references remain understandable after structural changes.</w:t>
+        <w:t>El plan de transición debe garantizar que las referencias del proyecto sigan siendo comprensibles después de los cambios estructurales.</w:t>
       </w:r>
     </w:p>
     <w:p>
@@ -128,7 +128,7 @@
         <w:pStyle w:val="Heading1"/>
       </w:pPr>
       <w:r>
-        <w:t>Final Reminder</w:t>
+        <w:t>Recordatorio final</w:t>
       </w:r>
     </w:p>
     <w:p>
@@ -136,7 +136,7 @@
         <w:rPr>
           <w:sz w:val="22"/>
         </w:rPr>
-        <w:t>Previous organisational documents must be preserved. Removing historical references may affect future audits and document interpretation.</w:t>
+        <w:t>Deben conservarse los documentos organizativos anteriores. La eliminación de referencias históricas puede afectar futuras auditorías e interpretación de documentos.</w:t>
       </w:r>
     </w:p>
     <w:sectPr>

</xml_diff>